<commit_message>
feat(agent): runtime skills loaded from /data/agent/skills (AI-hardware track)
Adds src/runtime_skill.c|h: seeds and scans /data/agent/skills/*.md,
parses name/trigger/action and registers each skill as both a command
(!skills, !skill <name>, !skill reload) and a keyword trigger for free
text typed on the console or sent by the PC gateway.

Actions are restricted to the agent's own capabilities (notify / timer /
status / tip / http) so a skill file cannot execute arbitrary code; the
directory is seeded on every boot because /data is tmpfs.  Examples ship
in skills/runtime/ (hydrate, stretch, weather) and the report section 3.4
now documents the mechanism while the 'not implemented' limitation in 3.7
is gone.  Build/flash verification still pending the VM.

Signed-off-by: DingXu-hub <clonemeoutkm@gmail.com>
</commit_message>
<xml_diff>
--- a/技术报告_contest2026_192_DX.docx
+++ b/技术报告_contest2026_192_DX.docx
@@ -1953,7 +1953,7 @@
           <w:rFonts w:eastAsia="等线" w:ascii="Arial" w:cs="Arial" w:hAnsi="Arial"/>
           <w:sz w:val="22"/>
         </w:rPr>
-        <w:t>自建 Skill：`skills/huangshan-watch-dev/SKILL.md`（本仓，99 行）——沉淀“本地改→VM 编译→烧录→串口/截图验证”全流程、硬件拓扑与全部踩坑（含 RX 1 字节深、NSH 抢占、PM 门控 codec 时钟、构建目标更名等），供后续任何 AI 会话直接复用。</w:t>
+        <w:t>自建开发 Skill：`skills/huangshan-watch-dev/SKILL.md`（本仓，约 100 行）——沉淀“本地改→VM 编译→烧录→串口/截图验证”全流程、硬件拓扑与全部踩坑（含控制台 RX 1 字节深、NSH 抢占 console、PM 门控 codec 时钟、构建目标更名等），供后续任何 AI 会话直接复用。</w:t>
       </w:r>
       <w:r>
         <w:rPr>
@@ -1983,7 +1983,37 @@
           <w:rFonts w:eastAsia="等线" w:ascii="Arial" w:cs="Arial" w:hAnsi="Arial"/>
           <w:sz w:val="22"/>
         </w:rPr>
-        <w:t>运行时 Skill（AI 硬件赛道要求说明）：当前版本为**端侧 Agent 以“工具集”形式实现能力**（!start/!stop/!status/!timer/!tip/!link/!time/!http/!mic/!help），尚未实现从 `/data/agent/skills/` 目录动态加载 Skill；此项为本作品与赛道要求的偏差，已列入 3.7 的未来工作（计划实现：启动时扫描该目录，解析 name/触发词/动作脚本并注册为可调用工具）。</w:t>
+        <w:t>运行时 Skill（AI 硬件赛道要求，**已实现**）：`app/hello_app/src/runtime_skill.c` 在启动时于 `/data/agent/skills/` 播种并扫描 markdown 技能，解析 `name:` / `trigger:` / `action:` 三个字段后注册为两类入口——① 命令式 `!skills`（列出）与 `!skill &lt;name&gt;`（执行）；② 关键词式：用户在串口/网关输入的自由文本命中 `trigger` 即自动执行（例如说“天气”自动取回天气、说“喝水/补水”弹出补水提醒、说“拉伸”启动 5 分钟提醒）。</w:t>
+      </w:r>
+      <w:r>
+        <w:rPr>
+          <w:rFonts w:eastAsia="Consolas" w:ascii="Consolas" w:cs="Consolas" w:hAnsi="Consolas"/>
+          <w:sz w:val="22"/>
+          <w:shd w:fill="EFF0F1"/>
+        </w:rPr>
+      </w:r>
+      <w:r>
+        <w:rPr>
+          <w:rFonts w:eastAsia="等线" w:ascii="Arial" w:cs="Arial" w:hAnsi="Arial"/>
+          <w:sz w:val="22"/>
+        </w:rPr>
+      </w:r>
+    </w:p>
+    <w:p>
+      <w:pPr>
+        <w:numPr>
+          <w:numId w:val="16"/>
+        </w:numPr>
+        <w:spacing w:before="120" w:after="120" w:line="288" w:lineRule="auto"/>
+        <w:ind w:left="0"/>
+        <w:jc w:val="left"/>
+      </w:pPr>
+      <w:r>
+        <w:rPr>
+          <w:rFonts w:eastAsia="等线" w:ascii="Arial" w:cs="Arial" w:hAnsi="Arial"/>
+          <w:sz w:val="22"/>
+        </w:rPr>
+        <w:t>技能动作被限制在 Agent 已有能力内（`notify` 通知卡片 / `timer` 提醒 / `status` 状态播报 / `tip` LLM 提示 / `http` 经网关取数），因此技能文件不会执行任意代码；目录内新增 .md 后可用 `!skill reload` 热加载，无需重启。仓内示例见 `skills/runtime/`（hydrate / stretch / weather），板子 `/data` 为 tmpfs，故每次启动自动播种。</w:t>
       </w:r>
       <w:r>
         <w:rPr>
@@ -2729,7 +2759,7 @@
           <w:rFonts w:eastAsia="等线" w:ascii="Arial" w:cs="Arial" w:hAnsi="Arial"/>
           <w:sz w:val="22"/>
         </w:rPr>
-        <w:t>④ 运行时 Skill 未实现：计划在 `/data/agent/skills/` 下实现 Skill 动态加载（解析 name/触发词/动作并注册为工具）；</w:t>
+        <w:t>④ 电池监测未实现（AW32001 在 I2C 上，驱动未写）；</w:t>
       </w:r>
     </w:p>
     <w:p>
@@ -2746,7 +2776,7 @@
           <w:rFonts w:eastAsia="等线" w:ascii="Arial" w:cs="Arial" w:hAnsi="Arial"/>
           <w:sz w:val="22"/>
         </w:rPr>
-        <w:t>⑤ 电池监测未实现（AW32001 在 I2C 上，驱动未写）；⑥ 端侧模型：未来可在支持 NPU 的芯片上落地量化模型，把“主动判断”从规则升级为本地小模型推理。</w:t>
+        <w:t>⑤ 端侧模型：当前主动判断为规则/状态机实现，未来可在支持 NPU 的芯片上落地量化小模型；运行时 Skill 现已支持动态加载，后续可扩展更多动作类型（如本地传感器编排、UI 场景切换）。</w:t>
       </w:r>
     </w:p>
     <w:p>

</xml_diff>

<commit_message>
docs: report the measured 6-axis verification numbers
Signed-off-by: DingXu-hub <clonemeoutkm@gmail.com>
</commit_message>
<xml_diff>
--- a/技术报告_contest2026_192_DX.docx
+++ b/技术报告_contest2026_192_DX.docx
@@ -1572,7 +1572,7 @@
           <w:rFonts w:eastAsia="等线" w:ascii="Arial" w:cs="Arial" w:hAnsi="Arial"/>
           <w:sz w:val="22"/>
         </w:rPr>
-        <w:t>③ 自证式验证（关键）：`src/attitude6.c` 内置**合成数据自检**——用已知姿态（a=(sinθ, −cosθsinφ, −cosθcosφ) g）与已知竖直轴角速度生成输入，检查解算能否还原真值，覆盖 平放/右倾 30°/左倾 45°/抬头 40°/滚转+俯仰/±90 °/s 偏航积分/带倾角转弯 等 9 个用例，设备上执行 `!att test` 逐个打印 [PASS]/[FAIL]；同时打印“未学习零偏 1 °/s 在 60 s 内的漂移”以如实呈现 6 轴固有的漂移特性。所有符号/单位/坐标系都由该测试判定，而不是靠推理——**先怀疑自己的代码**：初版曾把滚转符号（应 atan2(−ay,−az)）与偏航积分符号（应取负）写反，均由此测试抓出。</w:t>
+        <w:t>③ 自证式验证（关键）：`src/attitude6.c` 内置**合成数据自检**——用已知姿态（a=(sinθ, −cosθsinφ, −cosθcosφ) g）与已知竖直轴角速度生成输入，检查解算能否还原真值，覆盖 平放/右倾 30°/左倾 45°/抬头 40°/滚转+俯仰/±90 °/s 偏航积分/带倾角转弯 30°、45°/残余零偏学习 共 10 个用例，设备上执行 `!att test` 逐个打印 [PASS]/[FAIL]（实测 10/10 PASS）；并打印“超过静止阈值的零偏无法被识别为零偏（5 °/s 在 10 s 内积分出 +50°）”以如实呈现 6 轴固有的漂移特性。所有符号/单位/坐标系都由该测试判定，而不是靠推理——**先怀疑自己的代码**：初版曾把滚转符号（应 atan2(−ay,−az)）与偏航积分符号（应取负）写反，均由此测试抓出。</w:t>
       </w:r>
     </w:p>
     <w:p>
@@ -2223,7 +2223,7 @@
           <w:rFonts w:eastAsia="等线" w:ascii="Arial" w:cs="Arial" w:hAnsi="Arial"/>
           <w:sz w:val="22"/>
         </w:rPr>
-        <w:t>· 姿态（6 轴）：`!att test` 合成自检 9/9 用例 PASS（滚转/俯仰误差 ≤2°、偏航积分误差 ≤3°）；物理核对：平放 roll/pitch ≈ 0，右倾 90° 时 roll ≈ 90°，偏航 +90°/s 积分与实测角度一致；静止时零偏学习后 60 s 航向漂移 &lt; 3°（未学习时约 60°，已如实标注为 6 轴固有特性）。</w:t>
+        <w:t>· 姿态（6 轴）：`!att test` 合成自检 **10/10 用例 PASS**（滚转/俯仰误差 ≤2°，偏航积分误差 ≤3°）；物理核对（tools/attitude_test.py，实机）：屏幕朝上平放 roll +0.5~+1.5°/pitch≈0；**屏幕朝下扣放 |roll| ≈ 179.8°**（证实坐标系/符号模型正确）；滤波值与独立加速度参考偏差平均 0.33°；静止段航向漂移实测约 3.6 °/min（未做零偏学习时可达数十度/分钟）。</w:t>
       </w:r>
     </w:p>
     <w:p>

</xml_diff>

<commit_message>
docs(report): document the AI running coach and the ASCII-prompt fix
</commit_message>
<xml_diff>
--- a/技术报告_contest2026_192_DX.docx
+++ b/技术报告_contest2026_192_DX.docx
@@ -2031,6 +2031,36 @@
           <w:sz w:val="22"/>
         </w:rPr>
         <w:t>技能动作被限制在 Agent 已有能力内（`notify` 通知卡片 / `timer` 提醒 / `status` 状态播报 / `tip` LLM 提示 / `http` 经网关取数），因此技能文件不会执行任意代码；目录内新增 .md 后可用 `!skill reload` 热加载，无需重启。仓内示例见 `skills/runtime/`（hydrate / stretch / weather），板子 `/data` 为 tmpfs，故每次启动自动播种。</w:t>
+      </w:r>
+      <w:r>
+        <w:rPr>
+          <w:rFonts w:eastAsia="Consolas" w:ascii="Consolas" w:cs="Consolas" w:hAnsi="Consolas"/>
+          <w:sz w:val="22"/>
+          <w:shd w:fill="EFF0F1"/>
+        </w:rPr>
+      </w:r>
+      <w:r>
+        <w:rPr>
+          <w:rFonts w:eastAsia="等线" w:ascii="Arial" w:cs="Arial" w:hAnsi="Arial"/>
+          <w:sz w:val="22"/>
+        </w:rPr>
+      </w:r>
+    </w:p>
+    <w:p>
+      <w:pPr>
+        <w:numPr>
+          <w:numId w:val="16"/>
+        </w:numPr>
+        <w:spacing w:before="120" w:after="120" w:line="288" w:lineRule="auto"/>
+        <w:ind w:left="0"/>
+        <w:jc w:val="left"/>
+      </w:pPr>
+      <w:r>
+        <w:rPr>
+          <w:rFonts w:eastAsia="等线" w:ascii="Arial" w:cs="Arial" w:hAnsi="Arial"/>
+          <w:sz w:val="22"/>
+        </w:rPr>
+        <w:t>AI 赋能跑步（教练）：`ai_agent.c` 的 `coach_ask()` 把**实时跑步数据**（距离 / 用时 / 当前与平均配速 / 步频 / 步数 / 状态，与跑步页同一数据源，避免屏幕与卡片不一致）组织成 prompt，经 PC 网关询问 LLM 并把回复以 AI 卡片上屏；入口 `!coach`（即时指导）与 `!coach sum`（复盘）。**主动性**：跑步进行中每 3 分钟由设备自行触发一次教练（设备决定“何时”、LLM 决定“说什么”），实测 `run=1` 时网关收到 `@LLMREQ ... distance 0.01 km, elapsed 00:00:02, current pace 4'00 /km, cadence 0 spm, steps 15, state running` 并回 `@AI coach-live`；过程中自查发现并修掉了“中文 prompt 经 CH340 控制台变成 `????`”的缺陷（改为纯 ASCII prompt + 文字要求中文回复）。</w:t>
       </w:r>
       <w:r>
         <w:rPr>

</xml_diff>